<commit_message>
Rellena las guias 2.3, 2.4 y 2.6 y agrega los sprints de evidencia.
Co-authored-by: Cursor <cursoragent@cursor.com>
</commit_message>
<xml_diff>
--- a/Fase 2/Evidencias Grupales/2.3_APT122_FormativaAvance Fase2.docx
+++ b/Fase 2/Evidencias Grupales/2.3_APT122_FormativaAvance Fase2.docx
@@ -5709,6 +5709,76 @@
           <w:u w:val="single"/>
         </w:rPr>
       </w:pPr>
+    </w:p>
+    <w:p>
+      <w:r>
+        <w:rPr>
+          <w:rFonts w:ascii="Calibri" w:hAnsi="Calibri" w:eastAsia="Calibri"/>
+          <w:b/>
+          <w:sz w:val="28"/>
+        </w:rPr>
+        <w:t>Lectura del equipo 7 (no reemplaza la rúbrica)</w:t>
+      </w:r>
+    </w:p>
+    <w:p>
+      <w:r>
+        <w:rPr>
+          <w:rFonts w:ascii="Calibri" w:hAnsi="Calibri" w:eastAsia="Calibri"/>
+          <w:b w:val="0"/>
+          <w:sz w:val="22"/>
+        </w:rPr>
+        <w:t>Esta pauta la aplica el docente sobre el informe de avance. El informe rellenado es la guía 2.4 de esta misma carpeta. Aquí solo indicamos dónde está cada indicador. Corte: 30/09/2026.</w:t>
+      </w:r>
+    </w:p>
+    <w:p>
+      <w:r>
+        <w:rPr>
+          <w:rFonts w:ascii="Calibri" w:hAnsi="Calibri" w:eastAsia="Calibri"/>
+          <w:b w:val="0"/>
+          <w:sz w:val="22"/>
+        </w:rPr>
+        <w:t>1. Ajustes. En la 2.4, sección 3: construcción adelantada respecto de la carta, aprobación solo en la orden de compra, proyecto intermediario de facturación en agosto, y pantallas mostradas en julio, antes de la fecha de mockups de la carta. El objetivo general de la 1.5 no se cambió.</w:t>
+      </w:r>
+    </w:p>
+    <w:p>
+      <w:r>
+        <w:rPr>
+          <w:rFonts w:ascii="Calibri" w:hAnsi="Calibri" w:eastAsia="Calibri"/>
+          <w:b w:val="0"/>
+          <w:sz w:val="22"/>
+        </w:rPr>
+        <w:t>2. Metodología. Seguimos en Scrum: el cliente prioriza, el sprint es semanal y el incremento se acepta con el cliente. Quedó escrito en la 2.4 y en los sprints S1 a S12.</w:t>
+      </w:r>
+    </w:p>
+    <w:p>
+      <w:r>
+        <w:rPr>
+          <w:rFonts w:ascii="Calibri" w:hAnsi="Calibri" w:eastAsia="Calibri"/>
+          <w:b w:val="0"/>
+          <w:sz w:val="22"/>
+        </w:rPr>
+        <w:t>3. Evidencias. Sprints en Word, tablero con 29 tarjetas listas y 21 abiertas al cierre de S11, arquitectura, matriz del sistema actual y del nuevo, riesgos, plan de pruebas y revision de integridad.</w:t>
+      </w:r>
+    </w:p>
+    <w:p>
+      <w:r>
+        <w:rPr>
+          <w:rFonts w:ascii="Calibri" w:hAnsi="Calibri" w:eastAsia="Calibri"/>
+          <w:b w:val="0"/>
+          <w:sz w:val="22"/>
+        </w:rPr>
+        <w:t>4. Indicadores de calidad del perfil. El informe cubre requisitos, modelo por empresa, construcción, integración de facturación, pruebas con el cliente y la gestión del desfase de la carta. No declaramos aplicaciones móviles ni analisis de grandes datos.</w:t>
+      </w:r>
+    </w:p>
+    <w:p>
+      <w:r>
+        <w:rPr>
+          <w:rFonts w:ascii="Calibri" w:hAnsi="Calibri" w:eastAsia="Calibri"/>
+          <w:b w:val="0"/>
+          <w:sz w:val="22"/>
+        </w:rPr>
+        <w:t>5. Inglés. Hay un resumen en inglés al cierre del campo de evidencias de avance, en la guía 2.4.</w:t>
+      </w:r>
     </w:p>
     <w:sectPr>
       <w:headerReference w:type="default" r:id="rId12"/>

</xml_diff>